<commit_message>
RAG logic and code completed
</commit_message>
<xml_diff>
--- a/Project_Summary.docx
+++ b/Project_Summary.docx
@@ -3010,8 +3010,6 @@
       <w:r>
         <w:t>ANALYZE documents;</w:t>
       </w:r>
-      <w:bookmarkStart w:id="0" w:name="_GoBack"/>
-      <w:bookmarkEnd w:id="0"/>
     </w:p>
     <w:p>
       <w:pPr>
@@ -3903,6 +3901,202 @@
           </w14:textOutline>
         </w:rPr>
       </w:pPr>
+    </w:p>
+    <w:p>
+      <w:pPr>
+        <w:pStyle w:val="NoSpacing"/>
+        <w:rPr>
+          <w:color w:val="000000" w:themeColor="text1"/>
+          <w:sz w:val="20"/>
+          <w:szCs w:val="20"/>
+          <w14:shadow w14:blurRad="38100" w14:dist="19050" w14:dir="2700000" w14:sx="100000" w14:sy="100000" w14:kx="0" w14:ky="0" w14:algn="tl">
+            <w14:schemeClr w14:val="dk1">
+              <w14:alpha w14:val="60000"/>
+            </w14:schemeClr>
+          </w14:shadow>
+          <w14:textOutline w14:w="0" w14:cap="flat" w14:cmpd="sng" w14:algn="ctr">
+            <w14:noFill/>
+            <w14:prstDash w14:val="solid"/>
+            <w14:round/>
+          </w14:textOutline>
+        </w:rPr>
+      </w:pPr>
+    </w:p>
+    <w:p>
+      <w:pPr>
+        <w:pStyle w:val="NoSpacing"/>
+      </w:pPr>
+    </w:p>
+    <w:p>
+      <w:pPr>
+        <w:pStyle w:val="NoSpacing"/>
+      </w:pPr>
+    </w:p>
+    <w:p>
+      <w:pPr>
+        <w:pStyle w:val="NoSpacing"/>
+      </w:pPr>
+    </w:p>
+    <w:p>
+      <w:pPr>
+        <w:pStyle w:val="NoSpacing"/>
+      </w:pPr>
+    </w:p>
+    <w:p>
+      <w:pPr>
+        <w:pStyle w:val="NoSpacing"/>
+      </w:pPr>
+    </w:p>
+    <w:p>
+      <w:pPr>
+        <w:pStyle w:val="NoSpacing"/>
+      </w:pPr>
+    </w:p>
+    <w:p>
+      <w:pPr>
+        <w:pStyle w:val="NoSpacing"/>
+      </w:pPr>
+    </w:p>
+    <w:p>
+      <w:pPr>
+        <w:pStyle w:val="NoSpacing"/>
+        <w:rPr>
+          <w:b/>
+        </w:rPr>
+      </w:pPr>
+      <w:r>
+        <w:rPr>
+          <w:b/>
+        </w:rPr>
+        <w:lastRenderedPageBreak/>
+        <w:t xml:space="preserve">What </w:t>
+      </w:r>
+      <w:r>
+        <w:rPr>
+          <w:rStyle w:val="Emphasis"/>
+          <w:b/>
+        </w:rPr>
+        <w:t>you</w:t>
+      </w:r>
+      <w:r>
+        <w:rPr>
+          <w:b/>
+        </w:rPr>
+        <w:t xml:space="preserve"> should implement (honest answer)</w:t>
+      </w:r>
+    </w:p>
+    <w:p>
+      <w:pPr>
+        <w:pStyle w:val="NoSpacing"/>
+      </w:pPr>
+      <w:r>
+        <w:t>For your project stage, the smartest path is:</w:t>
+      </w:r>
+    </w:p>
+    <w:p>
+      <w:pPr>
+        <w:pStyle w:val="NoSpacing"/>
+      </w:pPr>
+      <w:r>
+        <w:t>1️</w:t>
+      </w:r>
+      <w:r>
+        <w:rPr>
+          <w:rFonts w:ascii="Tahoma" w:hAnsi="Tahoma" w:cs="Tahoma"/>
+        </w:rPr>
+        <w:t>⃣</w:t>
+      </w:r>
+      <w:r>
+        <w:t xml:space="preserve"> Conversation memory</w:t>
+      </w:r>
+    </w:p>
+    <w:p>
+      <w:pPr>
+        <w:pStyle w:val="NoSpacing"/>
+      </w:pPr>
+      <w:r>
+        <w:t xml:space="preserve">Makes the </w:t>
+      </w:r>
+      <w:proofErr w:type="spellStart"/>
+      <w:r>
+        <w:t>chatbot</w:t>
+      </w:r>
+      <w:proofErr w:type="spellEnd"/>
+      <w:r>
+        <w:t xml:space="preserve"> feel intelligent.</w:t>
+      </w:r>
+    </w:p>
+    <w:p>
+      <w:pPr>
+        <w:pStyle w:val="NoSpacing"/>
+      </w:pPr>
+      <w:r>
+        <w:t>2️</w:t>
+      </w:r>
+      <w:r>
+        <w:rPr>
+          <w:rFonts w:ascii="Tahoma" w:hAnsi="Tahoma" w:cs="Tahoma"/>
+        </w:rPr>
+        <w:t>⃣</w:t>
+      </w:r>
+      <w:r>
+        <w:t xml:space="preserve"> Streaming responses</w:t>
+      </w:r>
+    </w:p>
+    <w:p>
+      <w:pPr>
+        <w:pStyle w:val="NoSpacing"/>
+      </w:pPr>
+      <w:r>
+        <w:t>Huge UX improvement.</w:t>
+      </w:r>
+    </w:p>
+    <w:p>
+      <w:pPr>
+        <w:pStyle w:val="NoSpacing"/>
+      </w:pPr>
+      <w:r>
+        <w:t>3️</w:t>
+      </w:r>
+      <w:r>
+        <w:rPr>
+          <w:rFonts w:ascii="Tahoma" w:hAnsi="Tahoma" w:cs="Tahoma"/>
+        </w:rPr>
+        <w:t>⃣</w:t>
+      </w:r>
+      <w:r>
+        <w:t xml:space="preserve"> Metadata filtering</w:t>
+      </w:r>
+    </w:p>
+    <w:p>
+      <w:pPr>
+        <w:pStyle w:val="NoSpacing"/>
+      </w:pPr>
+      <w:r>
+        <w:t>Improves retrieval quality.</w:t>
+      </w:r>
+    </w:p>
+    <w:p>
+      <w:pPr>
+        <w:pStyle w:val="NoSpacing"/>
+        <w:rPr>
+          <w:color w:val="000000" w:themeColor="text1"/>
+          <w:sz w:val="20"/>
+          <w:szCs w:val="20"/>
+          <w14:shadow w14:blurRad="38100" w14:dist="19050" w14:dir="2700000" w14:sx="100000" w14:sy="100000" w14:kx="0" w14:ky="0" w14:algn="tl">
+            <w14:schemeClr w14:val="dk1">
+              <w14:alpha w14:val="60000"/>
+            </w14:schemeClr>
+          </w14:shadow>
+          <w14:textOutline w14:w="0" w14:cap="flat" w14:cmpd="sng" w14:algn="ctr">
+            <w14:noFill/>
+            <w14:prstDash w14:val="solid"/>
+            <w14:round/>
+          </w14:textOutline>
+        </w:rPr>
+      </w:pPr>
+      <w:bookmarkStart w:id="0" w:name="_GoBack"/>
+      <w:bookmarkEnd w:id="0"/>
     </w:p>
     <w:sectPr>
       <w:pgSz w:w="12240" w:h="15840"/>
@@ -5217,6 +5411,17 @@
       <w:bCs/>
     </w:rPr>
   </w:style>
+  <w:style w:type="character" w:styleId="Emphasis">
+    <w:name w:val="Emphasis"/>
+    <w:basedOn w:val="DefaultParagraphFont"/>
+    <w:uiPriority w:val="20"/>
+    <w:qFormat/>
+    <w:rsid w:val="004D3E7A"/>
+    <w:rPr>
+      <w:i/>
+      <w:iCs/>
+    </w:rPr>
+  </w:style>
 </w:styles>
 </file>
 

</xml_diff>